<commit_message>
suite: sync editor styles before keys; reshape doc-run-styles.uit to need no table navigation (#1427 r4)
Co-Authored-By: Claude Sonnet 5.5 <noreply@anthropic.com>
Claude-Session: https://claude.ai/code/session_019sZTsjdMzKoysZBMKx9d1b
</commit_message>
<xml_diff>
--- a/uiharness/fixtures/run-styles.docx
+++ b/uiharness/fixtures/run-styles.docx
@@ -2,22 +2,6 @@
 <file path=word/document.xml><?xml version="1.0" encoding="utf-8"?>
 <w:document xmlns:w="http://schemas.openxmlformats.org/wordprocessingml/2006/main" xmlns:r="http://schemas.openxmlformats.org/officeDocument/2006/relationships">
   <w:body>
-    <w:p>
-      <w:pPr>
-        <w:pStyle w:val="Heading1"/>
-      </w:pPr>
-      <w:r>
-        <w:t>Title</w:t>
-      </w:r>
-    </w:p>
-    <w:p>
-      <w:r>
-        <w:rPr>
-          <w:rStyle w:val="Strong"/>
-        </w:rPr>
-        <w:t>Strong</w:t>
-      </w:r>
-    </w:p>
     <w:tbl>
       <w:tblPr>
         <w:tblStyle w:val="HeaderBold"/>
@@ -45,7 +29,22 @@
         </w:tc>
       </w:tr>
     </w:tbl>
-    <w:p/>
+    <w:p>
+      <w:pPr>
+        <w:pStyle w:val="Heading1"/>
+      </w:pPr>
+      <w:r>
+        <w:t>Title</w:t>
+      </w:r>
+    </w:p>
+    <w:p>
+      <w:r>
+        <w:rPr>
+          <w:rStyle w:val="Strong"/>
+        </w:rPr>
+        <w:t>Strong</w:t>
+      </w:r>
+    </w:p>
     <w:sectPr>
       <w:pgSz w:w="12240" w:h="15840"/>
       <w:pgMar w:top="1440" w:right="1440" w:bottom="1440" w:left="1440" w:header="720" w:footer="720" w:gutter="0"/>

</xml_diff>